<commit_message>
docs: reflect ahead-of-schedule Elastic/Redis/GCS/SEO work in architecture docs
</commit_message>
<xml_diff>
--- a/docs/OpenOpportunity_Architecture.docx
+++ b/docs/OpenOpportunity_Architecture.docx
@@ -872,6 +872,17 @@
       </w:r>
     </w:p>
     <w:p>
+      <w:r>
+        <w:rPr>
+          <w:b/>
+        </w:rPr>
+        <w:t>Implementation status (Aug 2026):</w:t>
+      </w:r>
+      <w:r>
+        <w:t xml:space="preserve"> One deliberate, narrow exception to “no server rendering” above: individual job detail pages, sitemap.xml, and robots.txt are server-rendered by the backend (Cloud Run) instead of the SPA shell, with schema.org JobPosting structured data for Google’s Jobs rich-result surface — a non-JS crawler never executes the SPA’s client-side rendering, so those specific, SEO-critical routes need real HTML on first response. The load balancer routes only those exact paths to Cloud Run; every other path is still served exactly as described above. See com.openopportunity.seo and infra/job-seo.tf.</w:t>
+      </w:r>
+    </w:p>
+    <w:p>
       <w:pPr>
         <w:pStyle w:val="Heading1"/>
       </w:pPr>
@@ -2731,6 +2742,17 @@
       </w:r>
     </w:p>
     <w:p>
+      <w:r>
+        <w:rPr>
+          <w:b/>
+        </w:rPr>
+        <w:t>Implementation status (Aug 2026):</w:t>
+      </w:r>
+      <w:r>
+        <w:t xml:space="preserve"> The L1 (Caffeine) and L2 (Redis/Memorystore) caching tiers above are both implemented today, opt-in via app.cache.provider=redis (Caffeine remains the default) — shares the admin dashboard's cached report stats across instances instead of each one keeping its own. Not yet built: the L0 Cloud CDN edge cache and the Kafka-event-driven invalidation pattern described above. See com.openopportunity.config.RedisCacheConfig.</w:t>
+      </w:r>
+    </w:p>
+    <w:p>
       <w:pPr>
         <w:pStyle w:val="Heading2"/>
       </w:pPr>
@@ -2778,6 +2800,17 @@
       </w:r>
     </w:p>
     <w:p>
+      <w:r>
+        <w:rPr>
+          <w:b/>
+        </w:rPr>
+        <w:t>Implementation status (Aug 2026):</w:t>
+      </w:r>
+      <w:r>
+        <w:t xml:space="preserve"> A scoped version of job search is implemented and available today, opt-in via app.search.provider=elasticsearch (Postgres substring search remains the default) — real relevance-ranked (BM25) results instead of Postgres's recency-only fallback. Not yet built: the Kafka-async indexing pipeline, per-locale analyzer chains, candidate search, and the multi-zone/cross-cluster-replication deployment shape described below — those remain future work once real query volume justifies them. See com.openopportunity.search.</w:t>
+      </w:r>
+    </w:p>
+    <w:p>
       <w:pPr>
         <w:pStyle w:val="Heading2"/>
       </w:pPr>
@@ -2814,6 +2847,17 @@
     <w:p>
       <w:r>
         <w:br w:type="page"/>
+      </w:r>
+    </w:p>
+    <w:p>
+      <w:r>
+        <w:rPr>
+          <w:b/>
+        </w:rPr>
+        <w:t>Implementation status (Aug 2026):</w:t>
+      </w:r>
+      <w:r>
+        <w:t xml:space="preserve"> Implemented and available today, opt-in via app.storage.provider=gcs (local disk remains the default) — resumes, candidate photos, company logos, and certificates can be backed by Cloud Storage through the exact client code path that talks to real GCS in production, verified locally against a GCS API emulator before ever touching a real bucket. Not yet built: Cloud KMS server-side encryption, malware scanning on upload, and the dual/multi-region bucket class described above. See com.openopportunity.storage.</w:t>
       </w:r>
     </w:p>
     <w:p>

</xml_diff>

<commit_message>
feat: publish notification events to Kafka as an opt-in domain-event bus
</commit_message>
<xml_diff>
--- a/docs/OpenOpportunity_Architecture.docx
+++ b/docs/OpenOpportunity_Architecture.docx
@@ -2523,6 +2523,17 @@
     <w:p>
       <w:r>
         <w:br w:type="page"/>
+      </w:r>
+    </w:p>
+    <w:p>
+      <w:r>
+        <w:rPr>
+          <w:b/>
+        </w:rPr>
+        <w:t>Implementation status (Aug 2026):</w:t>
+      </w:r>
+      <w:r>
+        <w:t xml:space="preserve"> A scoped slice of the async-events pattern above is implemented and available today, opt-in via app.events.provider=kafka (in-process dispatch remains the default) — creating a notification (NotificationService.notify, called by JobService/ApplicationService/etc.) publishes a real domain event to a Kafka “notifications” topic instead of dispatching the email in-process, durable across a restart between publish and delivery. Backed locally by a single-node KRaft broker, no Zookeeper. Not yet built: the broader per-domain-event-type vocabulary (job.published, application.submitted, user.registered, ...), the Avro/Protobuf schema registry, and the outbox pattern described above — this only covers notification delivery so far. See com.openopportunity.notification.</w:t>
       </w:r>
     </w:p>
     <w:p>

</xml_diff>

<commit_message>
Feat/kafka notification events (#209)
* feat: publish notification events to Kafka as an opt-in domain-event bus

* feat: publish notification events to Kafka as an opt-in domain-event bus

---------

Co-authored-by: Bhaskar <bhaskar@Bhaskars-MacBook-Air.local>
</commit_message>
<xml_diff>
--- a/docs/OpenOpportunity_Architecture.docx
+++ b/docs/OpenOpportunity_Architecture.docx
@@ -2523,6 +2523,17 @@
     <w:p>
       <w:r>
         <w:br w:type="page"/>
+      </w:r>
+    </w:p>
+    <w:p>
+      <w:r>
+        <w:rPr>
+          <w:b/>
+        </w:rPr>
+        <w:t>Implementation status (Aug 2026):</w:t>
+      </w:r>
+      <w:r>
+        <w:t xml:space="preserve"> A scoped slice of the async-events pattern above is implemented and available today, opt-in via app.events.provider=kafka (in-process dispatch remains the default) — creating a notification (NotificationService.notify, called by JobService/ApplicationService/etc.) publishes a real domain event to a Kafka “notifications” topic instead of dispatching the email in-process, durable across a restart between publish and delivery. Backed locally by a single-node KRaft broker, no Zookeeper. Not yet built: the broader per-domain-event-type vocabulary (job.published, application.submitted, user.registered, ...), the Avro/Protobuf schema registry, and the outbox pattern described above — this only covers notification delivery so far. See com.openopportunity.notification.</w:t>
       </w:r>
     </w:p>
     <w:p>

</xml_diff>